<commit_message>
feat: add low-typing final task assessment
</commit_message>
<xml_diff>
--- a/学习活动设计—教师版.docx
+++ b/学习活动设计—教师版.docx
@@ -477,7 +477,7 @@
           <w:sz w:val="22"/>
           <w:szCs w:val="22"/>
         </w:rPr>
-        <w:t xml:space="preserve">项目作品：①控制线索簿与迁移表达；②自创机关卡及设计理由；③自测、同伴试验和修改记录。真实受众是同伴与教师；重点评价控制原理和验证证据。</w:t>
+        <w:t xml:space="preserve">项目作品：①控制线索簿与终局任务单考核；②自创机关卡及设计理由；③自测、同伴试验和修改记录。终局考核用五个点击判断和四组选项拼句替代长篇输入；真实受众是同伴与教师，重点评价控制原理和验证证据。</w:t>
       </w:r>
     </w:p>
     <w:tbl>
@@ -2305,7 +2305,7 @@
           <w:sz w:val="22"/>
           <w:szCs w:val="22"/>
         </w:rPr>
-        <w:t xml:space="preserve">产出：出口开启与学习报告。游戏选择题判断取证，开放迁移表达由教师或同伴评阅，不能仅凭晶石数量判断学生已完全掌握。</w:t>
+        <w:t xml:space="preserve">产出：出口开启与学习报告。终局考核对应任务单的设备—功能—控制方法、街道设备、观察调整、设备发展和迁移表达；学生点击五个判断并用四组选项拼出一句表达，不要求长篇打字。自创机关理由与同伴验证作为项目证据，不能仅凭晶石数量判断学生已完全掌握。</w:t>
       </w:r>
     </w:p>
     <w:p>

</xml_diff>

<commit_message>
feat: guide device puzzles through scenarios and expand assessment
</commit_message>
<xml_diff>
--- a/学习活动设计—教师版.docx
+++ b/学习活动设计—教师版.docx
@@ -477,7 +477,7 @@
           <w:sz w:val="22"/>
           <w:szCs w:val="22"/>
         </w:rPr>
-        <w:t xml:space="preserve">项目作品：①控制线索簿与终局任务单考核；②自创机关卡及设计理由；③自测、同伴试验和修改记录。终局考核用五个点击判断和四组选项拼句替代长篇输入；真实受众是同伴与教师，重点评价控制原理和验证证据。</w:t>
+        <w:t xml:space="preserve">项目作品：①控制线索簿与终局任务单考核；②自创机关卡及设计理由；③自测、同伴试验和修改记录。终局考核含16道情境题（四组，每组4题）及四组选项拼句，覆盖基本应用、身边系统、设备发展、探究与迁移；真实受众是同伴与教师，重点评价控制原理和验证证据。</w:t>
       </w:r>
     </w:p>
     <w:tbl>
@@ -1282,7 +1282,7 @@
                 <w:sz w:val="20"/>
                 <w:szCs w:val="20"/>
               </w:rPr>
-              <w:t xml:space="preserve">5—30分钟</w:t>
+              <w:t xml:space="preserve">5—27分钟</w:t>
             </w:r>
           </w:p>
         </w:tc>
@@ -1310,7 +1310,7 @@
                 <w:sz w:val="20"/>
                 <w:szCs w:val="20"/>
               </w:rPr>
-              <w:t xml:space="preserve">六间密室主线；每间轮换操作员与观察员。</w:t>
+              <w:t xml:space="preserve">六间密室情境探究；根据期望效果选择设置，每间轮换操作与观察。</w:t>
             </w:r>
           </w:p>
         </w:tc>
@@ -1338,7 +1338,7 @@
                 <w:sz w:val="20"/>
                 <w:szCs w:val="20"/>
               </w:rPr>
-              <w:t xml:space="preserve">巡视线索簿，针对开机与模式混淆及时追问。约25分钟为估计。</w:t>
+              <w:t xml:space="preserve">巡视学生的预测与前后比较，避免提前说出目标挡位、模式或角色。</w:t>
             </w:r>
           </w:p>
         </w:tc>
@@ -1372,7 +1372,7 @@
                 <w:sz w:val="20"/>
                 <w:szCs w:val="20"/>
               </w:rPr>
-              <w:t xml:space="preserve">30—35分钟</w:t>
+              <w:t xml:space="preserve">27—37分钟</w:t>
             </w:r>
           </w:p>
         </w:tc>
@@ -1400,7 +1400,7 @@
                 <w:sz w:val="20"/>
                 <w:szCs w:val="20"/>
               </w:rPr>
-              <w:t xml:space="preserve">自创风力机关，先自测，再交给同伴试验并修改。</w:t>
+              <w:t xml:space="preserve">四组16题终局考核，查阅发展档案并点击作答，完成迁移拼句。</w:t>
             </w:r>
           </w:p>
         </w:tc>
@@ -1428,7 +1428,7 @@
                 <w:sz w:val="20"/>
                 <w:szCs w:val="20"/>
               </w:rPr>
-              <w:t xml:space="preserve">要求写明任务条件和理由；保留至少一次同伴反馈。</w:t>
+              <w:t xml:space="preserve">先保留首答，再根据反馈订正；查看需要支持的知识点。</w:t>
             </w:r>
           </w:p>
         </w:tc>
@@ -1462,7 +1462,7 @@
                 <w:sz w:val="20"/>
                 <w:szCs w:val="20"/>
               </w:rPr>
-              <w:t xml:space="preserve">35—40分钟</w:t>
+              <w:t xml:space="preserve">37—40分钟</w:t>
             </w:r>
           </w:p>
         </w:tc>
@@ -1490,7 +1490,7 @@
                 <w:sz w:val="20"/>
                 <w:szCs w:val="20"/>
               </w:rPr>
-              <w:t xml:space="preserve">展示一个有改进的案例；独立完成迁移题并导出报告。</w:t>
+              <w:t xml:space="preserve">展示一次有依据的调整或设备发展发现，导出学习报告。</w:t>
             </w:r>
           </w:p>
         </w:tc>
@@ -1518,7 +1518,7 @@
                 <w:sz w:val="20"/>
                 <w:szCs w:val="20"/>
               </w:rPr>
-              <w:t xml:space="preserve">依据证据评价三个目标；学生没完成主线时保留进度，课后续玩。</w:t>
+              <w:t xml:space="preserve">结合首答、订正、操作记录判断目标达成；提早完成者可自创机关。</w:t>
             </w:r>
           </w:p>
         </w:tc>
@@ -1534,7 +1534,7 @@
           <w:sz w:val="22"/>
           <w:szCs w:val="22"/>
         </w:rPr>
-        <w:t xml:space="preserve">用时调整：基础较弱班级可将自创机关放到课后或下一课前5分钟，课堂保留迁移检测。主线为25—30分钟设计量，尚未经过真实学生课堂实测，不用强制等待填满时间。</w:t>
+        <w:t xml:space="preserve">课堂反馈：教师已使用旧版，反馈学生完成过快。本版据此改为情境探究、观察式反馈及16题考核。以上时间为调整建议，需在下一次课堂观察。自创机关可供提前完成者挑战或课后延续，不用强制等待填满时间。</w:t>
       </w:r>
     </w:p>
     <w:p>
@@ -1562,6 +1562,19 @@
     </w:p>
     <w:p>
       <w:pPr>
+        <w:spacing w:after="100" w:line="300" w:lineRule="exact"/>
+      </w:pPr>
+      <w:r>
+        <w:rPr>
+          <w:rFonts w:ascii="Songti SC" w:cs="Songti SC" w:eastAsia="Songti SC" w:hAnsi="Songti SC"/>
+          <w:sz w:val="22"/>
+          <w:szCs w:val="22"/>
+        </w:rPr>
+        <w:t xml:space="preserve">学生看到的是情境与期望效果，不直接显示应选挡位或模式。失败反馈只描述观察结果。每个任务有观察线索、思考方向、具体帮助三级提示；最后一级在至少一次试运行后按需查看。</w:t>
+      </w:r>
+    </w:p>
+    <w:p>
+      <w:pPr>
         <w:pStyle w:val="Heading2"/>
         <w:keepNext/>
         <w:spacing w:after="100" w:before="150"/>
@@ -1588,7 +1601,7 @@
           <w:sz w:val="22"/>
           <w:szCs w:val="22"/>
         </w:rPr>
-        <w:t xml:space="preserve">任务链：开照明灯找调查笔记 → 启动投影、合窗帘并关照明，使图案清楚 → 启动播放器，音量设2格。学生预测后试运行，比较设备与环境状态。</w:t>
+        <w:t xml:space="preserve">教师核对（不预先展示给学生）：开照明灯找调查笔记 → 启动投影、合窗帘并关照明，使图案清楚 → 启动播放器，音量设2格。学生预测后试运行，比较设备与环境状态。</w:t>
       </w:r>
     </w:p>
     <w:p>
@@ -1645,7 +1658,7 @@
           <w:sz w:val="22"/>
           <w:szCs w:val="22"/>
         </w:rPr>
-        <w:t xml:space="preserve">任务链：风扇开、3挡推动模拟叶轮 → 改为1挡轻送羽片 → 保持1挡并定时30分钟。试运行快进时间，展示“15分钟仍运行—30分钟停止”。</w:t>
+        <w:t xml:space="preserve">教师核对（不预先展示给学生）：风扇开、3挡推动模拟叶轮 → 改为1挡轻送羽片 → 保持1挡并定时30分钟。试运行快进时间，展示“15分钟仍运行—30分钟停止”。</w:t>
       </w:r>
     </w:p>
     <w:p>
@@ -1702,7 +1715,7 @@
           <w:sz w:val="22"/>
           <w:szCs w:val="22"/>
         </w:rPr>
-        <w:t xml:space="preserve">任务链：洗衣机开并选脱水 → 切换快洗 → 电饭锅开并选煮粥。学生需要操作电源与模式两个控制位置，错误时先看结果再修改。</w:t>
+        <w:t xml:space="preserve">教师核对（不预先展示给学生）：洗衣机开并选脱水 → 切换快洗 → 电饭锅开并选煮粥。学生需要操作电源与模式两个控制位置，错误时先看结果再修改。</w:t>
       </w:r>
     </w:p>
     <w:p>
@@ -2178,7 +2191,7 @@
           <w:sz w:val="22"/>
           <w:szCs w:val="22"/>
         </w:rPr>
-        <w:t xml:space="preserve">任务链：选择驾驶员、启动车辆 → 切换交通管理部门、设为东西通行 → 切换城市管理部门、打开路灯。动画在交通调度阶段服从信号状态。</w:t>
+        <w:t xml:space="preserve">教师核对（不预先展示给学生）：选择驾驶员、启动车辆 → 切换交通管理部门、设为东西通行 → 切换城市管理部门、打开路灯。动画在交通调度阶段服从信号状态。</w:t>
       </w:r>
     </w:p>
     <w:p>
@@ -2235,7 +2248,7 @@
           <w:sz w:val="22"/>
           <w:szCs w:val="22"/>
         </w:rPr>
-        <w:t xml:space="preserve">任务链：依据锁孔提示选齿形钥匙并转动 → 从前三枚晶石刻字按顺序组合密码（246）并验证 → 比较两次操作，选择“控制方法改变，开门功能保留”。</w:t>
+        <w:t xml:space="preserve">教师核对（不预先展示给学生）：依据锁孔提示选齿形钥匙并转动 → 从前三枚晶石刻字按顺序组合密码（246）并验证 → 比较两次操作，选择“控制方法改变，开门功能保留”。</w:t>
       </w:r>
     </w:p>
     <w:p>
@@ -2292,20 +2305,20 @@
           <w:sz w:val="22"/>
           <w:szCs w:val="22"/>
         </w:rPr>
-        <w:t xml:space="preserve">任务链：清晰显示出口地图 → 风扇2挡、定时30分钟运送钥匙 → 播放器音量1格轻声提示。需要将已有方法迁移到新的数值要求。最终解释：先了解需求和控制方法，再操作并观察结果。</w:t>
-      </w:r>
-    </w:p>
-    <w:p>
-      <w:pPr>
-        <w:spacing w:after="100" w:line="300" w:lineRule="exact"/>
-      </w:pPr>
-      <w:r>
-        <w:rPr>
-          <w:rFonts w:ascii="Songti SC" w:cs="Songti SC" w:eastAsia="Songti SC" w:hAnsi="Songti SC"/>
-          <w:sz w:val="22"/>
-          <w:szCs w:val="22"/>
-        </w:rPr>
-        <w:t xml:space="preserve">产出：出口开启与学习报告。终局考核对应任务单的设备—功能—控制方法、街道设备、观察调整、设备发展和迁移表达；学生点击五个判断并用四组选项拼出一句表达，不要求长篇打字。自创机关理由与同伴验证作为项目证据，不能仅凭晶石数量判断学生已完全掌握。</w:t>
+        <w:t xml:space="preserve">教师核对（不预先展示给学生）：清晰显示出口地图 → 风扇2挡、定时30分钟运送钥匙 → 播放器音量1格轻声提示。需要将已有方法迁移到新的数值要求。最终解释：先了解需求和控制方法，再操作并观察结果。</w:t>
+      </w:r>
+    </w:p>
+    <w:p>
+      <w:pPr>
+        <w:spacing w:after="100" w:line="300" w:lineRule="exact"/>
+      </w:pPr>
+      <w:r>
+        <w:rPr>
+          <w:rFonts w:ascii="Songti SC" w:cs="Songti SC" w:eastAsia="Songti SC" w:hAnsi="Songti SC"/>
+          <w:sz w:val="22"/>
+          <w:szCs w:val="22"/>
+        </w:rPr>
+        <w:t xml:space="preserve">产出：出口开启与学习报告。终局考核对应任务单的设备—功能—控制方法、街道设备、观察调整、设备发展和迁移表达；学生分四组完成16道题，并用四组选项拼出表达。后8题重点比较早期设备用途、门锁变化、新旧并存、调查问题与比较证据；不要求长篇打字。自创机关理由与同伴验证作为项目证据，不能仅凭晶石数量判断学生已完全掌握。</w:t>
       </w:r>
     </w:p>
     <w:p>
@@ -2399,6 +2412,19 @@
           <w:szCs w:val="30"/>
         </w:rPr>
         <w:t xml:space="preserve">八、评价设计与重难点突破</w:t>
+      </w:r>
+    </w:p>
+    <w:p>
+      <w:pPr>
+        <w:spacing w:after="100" w:line="300" w:lineRule="exact"/>
+      </w:pPr>
+      <w:r>
+        <w:rPr>
+          <w:rFonts w:ascii="Songti SC" w:cs="Songti SC" w:eastAsia="Songti SC" w:hAnsi="Songti SC"/>
+          <w:sz w:val="22"/>
+          <w:szCs w:val="22"/>
+        </w:rPr>
+        <w:t xml:space="preserve">终局：16题分为设备与效果、身边的控制系统、设备的发展、拓展调查与迁移四组。提交前不显示正误；报告分别保存首答与最近订正，迁移拼句还核对设备、功能与控制方法的对应关系。</w:t>
       </w:r>
     </w:p>
     <w:tbl>
@@ -3035,7 +3061,7 @@
                 <w:sz w:val="20"/>
                 <w:szCs w:val="20"/>
               </w:rPr>
-              <w:t xml:space="preserve">追问“任务要脱水，你现在选的是什么模式？”要求对照结果，改一个设置再试。</w:t>
+              <w:t xml:space="preserve">追问“布片已干净，现在还想改变它的什么状态？”要求对照结果，改一个设置再试。</w:t>
             </w:r>
           </w:p>
         </w:tc>

</xml_diff>